<commit_message>
Clenea de datos faltantes
</commit_message>
<xml_diff>
--- a/informe/informe.docx
+++ b/informe/informe.docx
@@ -12302,6 +12302,56 @@
               <w:jc w:val="left"/>
             </w:pPr>
             <w:r>
+              <w:t xml:space="preserve">Estaciones del Metro</w:t>
+            </w:r>
+          </w:p>
+        </w:tc>
+        <w:tc>
+          <w:tcPr/>
+          <w:p>
+            <w:pPr>
+              <w:pStyle w:val="Compact"/>
+              <w:jc w:val="left"/>
+            </w:pPr>
+            <w:r>
+              <w:t xml:space="preserve">2021</w:t>
+            </w:r>
+          </w:p>
+        </w:tc>
+        <w:tc>
+          <w:tcPr/>
+          <w:p>
+            <w:pPr>
+              <w:pStyle w:val="Compact"/>
+              <w:jc w:val="right"/>
+            </w:pPr>
+            <w:r>
+              <w:t xml:space="preserve">195 estaciones</w:t>
+            </w:r>
+          </w:p>
+        </w:tc>
+        <w:tc>
+          <w:tcPr/>
+          <w:p>
+            <w:pPr>
+              <w:pStyle w:val="Compact"/>
+              <w:jc w:val="left"/>
+            </w:pPr>
+            <w:r>
+              <w:t xml:space="preserve">Coordenadas para asignar la alcaldía</w:t>
+            </w:r>
+          </w:p>
+        </w:tc>
+      </w:tr>
+      <w:tr>
+        <w:tc>
+          <w:tcPr/>
+          <w:p>
+            <w:pPr>
+              <w:pStyle w:val="Compact"/>
+              <w:jc w:val="left"/>
+            </w:pPr>
+            <w:r>
               <w:t xml:space="preserve">Semáforo federal</w:t>
             </w:r>
           </w:p>
@@ -12927,7 +12977,7 @@
     </w:p>
     <w:bookmarkEnd w:id="68"/>
     <w:bookmarkEnd w:id="69"/>
-    <w:bookmarkStart w:id="161" w:name="sec:limpieza"/>
+    <w:bookmarkStart w:id="162" w:name="sec:limpieza"/>
     <w:p>
       <w:pPr>
         <w:pStyle w:val="Heading1"/>
@@ -13367,25 +13417,19 @@
         <w:t xml:space="preserve"> </w:t>
       </w:r>
       <w:r>
-        <w:t xml:space="preserve">no</w:t>
-      </w:r>
-      <w:r>
-        <w:t xml:space="preserve"> </w:t>
-      </w:r>
-      <w:r>
-        <w:t xml:space="preserve">traen coordenadas, así que se conservan para el total de la ciudad con la clave</w:t>
-      </w:r>
-      <w:r>
-        <w:t xml:space="preserve"> </w:t>
-      </w:r>
-      <w:r>
-        <w:rPr>
-          <w:rStyle w:val="VerbatimChar"/>
-        </w:rPr>
-        <w:t xml:space="preserve">09000</w:t>
-      </w:r>
-      <w:r>
-        <w:t xml:space="preserve">.</w:t>
+        <w:t xml:space="preserve">y los</w:t>
+      </w:r>
+      <w:r>
+        <w:t xml:space="preserve"> </w:t>
+      </w:r>
+      <w:r>
+        <w:t xml:space="preserve">que vienen vacíos no traen coordenadas, así que no se pueden asignar a ninguna alcaldía y se</w:t>
+      </w:r>
+      <w:r>
+        <w:t xml:space="preserve"> </w:t>
+      </w:r>
+      <w:r>
+        <w:t xml:space="preserve">descartan (18,595, menos del 1 %). Así todas las tablas del proyecto usan las mismas 16 alcaldías.</w:t>
       </w:r>
     </w:p>
     <w:p>
@@ -13837,7 +13881,7 @@
               <w:jc w:val="left"/>
             </w:pPr>
             <w:r>
-              <w:t xml:space="preserve">se conservan (clave 09000)</w:t>
+              <w:t xml:space="preserve">se descartan</w:t>
             </w:r>
           </w:p>
         </w:tc>
@@ -13863,7 +13907,7 @@
               <w:jc w:val="right"/>
             </w:pPr>
             <w:r>
-              <w:t xml:space="preserve">66,960</w:t>
+              <w:t xml:space="preserve">65,430</w:t>
             </w:r>
           </w:p>
         </w:tc>
@@ -13901,7 +13945,7 @@
               <w:jc w:val="right"/>
             </w:pPr>
             <w:r>
-              <w:t xml:space="preserve">30,814</w:t>
+              <w:t xml:space="preserve">29,600</w:t>
             </w:r>
           </w:p>
         </w:tc>
@@ -13947,19 +13991,19 @@
                 <w:b/>
                 <w:bCs/>
               </w:rPr>
-              <w:t xml:space="preserve">1,937,812</w:t>
-            </w:r>
-          </w:p>
-        </w:tc>
-        <w:tc>
-          <w:tcPr/>
-          <w:p>
-            <w:pPr>
-              <w:pStyle w:val="Compact"/>
-              <w:jc w:val="left"/>
-            </w:pPr>
-            <w:r>
-              <w:t xml:space="preserve">97.5 % del original</w:t>
+              <w:t xml:space="preserve">1,919,217</w:t>
+            </w:r>
+          </w:p>
+        </w:tc>
+        <w:tc>
+          <w:tcPr/>
+          <w:p>
+            <w:pPr>
+              <w:pStyle w:val="Compact"/>
+              <w:jc w:val="left"/>
+            </w:pPr>
+            <w:r>
+              <w:t xml:space="preserve">96.6 % del original</w:t>
             </w:r>
           </w:p>
         </w:tc>
@@ -14005,22 +14049,13 @@
         <w:t xml:space="preserve"> </w:t>
       </w:r>
       <w:r>
-        <w:t xml:space="preserve">(34,683 filas). Esta tabla incluye la clave INEGI y el nombre de la alcaldía; las carpetas sin</w:t>
-      </w:r>
-      <w:r>
-        <w:t xml:space="preserve"> </w:t>
-      </w:r>
-      <w:r>
-        <w:t xml:space="preserve">alcaldía identificable aparecen con la clave 09000 y el nombre</w:t>
-      </w:r>
-      <w:r>
-        <w:t xml:space="preserve"> </w:t>
-      </w:r>
-      <w:r>
-        <w:t xml:space="preserve">“CDMX (sin alcaldía)”</w:t>
-      </w:r>
-      <w:r>
-        <w:t xml:space="preserve">.</w:t>
+        <w:t xml:space="preserve">(33,478 filas). Esta tabla incluye la clave INEGI y el nombre de la alcaldía, y todas sus filas</w:t>
+      </w:r>
+      <w:r>
+        <w:t xml:space="preserve"> </w:t>
+      </w:r>
+      <w:r>
+        <w:t xml:space="preserve">corresponden a una de las 16 alcaldías.</w:t>
       </w:r>
     </w:p>
     <w:bookmarkEnd w:id="73"/>
@@ -14085,7 +14120,7 @@
         <w:t xml:space="preserve"> </w:t>
       </w:r>
       <w:r>
-        <w:t xml:space="preserve">carpetas en 2019, 12,306 en 2020 y 10,682 en 2023). Sin embargo,</w:t>
+        <w:t xml:space="preserve">carpetas en 2019, 12,304 en 2020 y 10,579 en 2023). Sin embargo,</w:t>
       </w:r>
       <w:r>
         <w:t xml:space="preserve"> </w:t>
@@ -14139,7 +14174,7 @@
         <w:t xml:space="preserve"> </w:t>
       </w:r>
       <w:r>
-        <w:t xml:space="preserve">dificultó denunciar, y después subió con fuerza (25,802 en 2019, 28,340 en 2020 y 37,310</w:t>
+        <w:t xml:space="preserve">dificultó denunciar, y después subió con fuerza (25,780 en 2019, 28,311 en 2020 y 36,686</w:t>
       </w:r>
       <w:r>
         <w:t xml:space="preserve"> </w:t>
@@ -14416,19 +14451,19 @@
               <w:jc w:val="left"/>
             </w:pPr>
             <w:r>
-              <w:t xml:space="preserve">Vacíos antes de la inauguración de cada línea</w:t>
-            </w:r>
-          </w:p>
-        </w:tc>
-        <w:tc>
-          <w:tcPr/>
-          <w:p>
-            <w:pPr>
-              <w:pStyle w:val="Compact"/>
-              <w:jc w:val="left"/>
-            </w:pPr>
-            <w:r>
-              <w:t xml:space="preserve">17,227; no son faltantes, se marcan</w:t>
+              <w:t xml:space="preserve">Filas antes de la inauguración de cada línea</w:t>
+            </w:r>
+          </w:p>
+        </w:tc>
+        <w:tc>
+          <w:tcPr/>
+          <w:p>
+            <w:pPr>
+              <w:pStyle w:val="Compact"/>
+              <w:jc w:val="left"/>
+            </w:pPr>
+            <w:r>
+              <w:t xml:space="preserve">17,227; no son faltantes, se eliminan</w:t>
             </w:r>
           </w:p>
         </w:tc>
@@ -14532,7 +14567,7 @@
               <w:jc w:val="left"/>
             </w:pPr>
             <w:r>
-              <w:t xml:space="preserve">2; se anulan</w:t>
+              <w:t xml:space="preserve">2; se anulan y se rellenan con el mismo día de la semana anterior y siguiente</w:t>
             </w:r>
           </w:p>
         </w:tc>
@@ -14626,6 +14661,56 @@
       </w:pPr>
       <w:r>
         <w:t xml:space="preserve">20 de septiembre de 2017, Línea 2: 9 pasajeros.</w:t>
+      </w:r>
+    </w:p>
+    <w:p>
+      <w:pPr>
+        <w:pStyle w:val="FirstParagraph"/>
+      </w:pPr>
+      <w:r>
+        <w:t xml:space="preserve">Para no dejar huecos, ambos se rellenaron con el promedio del mismo día de la semana, una semana antes</w:t>
+      </w:r>
+      <w:r>
+        <w:t xml:space="preserve"> </w:t>
+      </w:r>
+      <w:r>
+        <w:t xml:space="preserve">y una después (231,380 y 173,858 viajes; en el primer caso solo existe la semana siguiente, porque es</w:t>
+      </w:r>
+      <w:r>
+        <w:t xml:space="preserve"> </w:t>
+      </w:r>
+      <w:r>
+        <w:t xml:space="preserve">el día de la inauguración), y se marcaron con la columna</w:t>
+      </w:r>
+      <w:r>
+        <w:t xml:space="preserve"> </w:t>
+      </w:r>
+      <w:r>
+        <w:rPr>
+          <w:rStyle w:val="VerbatimChar"/>
+        </w:rPr>
+        <w:t xml:space="preserve">imputado</w:t>
+      </w:r>
+      <w:r>
+        <w:t xml:space="preserve">. Las filas anteriores a la</w:t>
+      </w:r>
+      <w:r>
+        <w:t xml:space="preserve"> </w:t>
+      </w:r>
+      <w:r>
+        <w:t xml:space="preserve">inauguración de cada línea se eliminaron de la tabla diaria, porque la línea no existía; en la tabla</w:t>
+      </w:r>
+      <w:r>
+        <w:t xml:space="preserve"> </w:t>
+      </w:r>
+      <w:r>
+        <w:t xml:space="preserve">mensual, la afluencia de una línea en los meses previos a su apertura es 0. Así, ninguna de las dos</w:t>
+      </w:r>
+      <w:r>
+        <w:t xml:space="preserve"> </w:t>
+      </w:r>
+      <w:r>
+        <w:t xml:space="preserve">tablas tiene vacíos.</w:t>
       </w:r>
     </w:p>
     <w:bookmarkEnd w:id="81"/>
@@ -17542,7 +17627,7 @@
     <w:bookmarkEnd w:id="130"/>
     <w:bookmarkEnd w:id="131"/>
     <w:bookmarkEnd w:id="132"/>
-    <w:bookmarkStart w:id="151" w:name="afluencia-del-metro"/>
+    <w:bookmarkStart w:id="152" w:name="afluencia-del-metro"/>
     <w:p>
       <w:pPr>
         <w:pStyle w:val="Heading2"/>
@@ -18343,7 +18428,148 @@
       </w:r>
     </w:p>
     <w:bookmarkEnd w:id="136"/>
-    <w:bookmarkStart w:id="137" w:name="cierres-de-líneas.-1"/>
+    <w:bookmarkStart w:id="137" w:name="clave-de-alcaldía-por-estación."/>
+    <w:p>
+      <w:pPr>
+        <w:pStyle w:val="Heading4"/>
+      </w:pPr>
+      <w:r>
+        <w:t xml:space="preserve">Clave de alcaldía por estación.</w:t>
+      </w:r>
+    </w:p>
+    <w:p>
+      <w:pPr>
+        <w:pStyle w:val="FirstParagraph"/>
+      </w:pPr>
+      <w:r>
+        <w:t xml:space="preserve">La afluencia del Metro no trae alcaldía. Para poder unirla</w:t>
+      </w:r>
+      <w:r>
+        <w:t xml:space="preserve"> </w:t>
+      </w:r>
+      <w:r>
+        <w:t xml:space="preserve">con las demás fuentes se descargó el conjunto</w:t>
+      </w:r>
+      <w:r>
+        <w:t xml:space="preserve"> </w:t>
+      </w:r>
+      <w:r>
+        <w:t xml:space="preserve">“Líneas y Estaciones del STC Metro”</w:t>
+      </w:r>
+      <w:r>
+        <w:t xml:space="preserve"> </w:t>
+      </w:r>
+      <w:r>
+        <w:t xml:space="preserve">del portal de</w:t>
+      </w:r>
+      <w:r>
+        <w:t xml:space="preserve"> </w:t>
+      </w:r>
+      <w:r>
+        <w:t xml:space="preserve">la CDMX, con las coordenadas de las 195 estaciones. La alcaldía se asignó por coordenadas (punto en</w:t>
+      </w:r>
+      <w:r>
+        <w:t xml:space="preserve"> </w:t>
+      </w:r>
+      <w:r>
+        <w:t xml:space="preserve">polígono), porque 15 estaciones que están en el límite traen dos alcaldías en el nombre. Tres</w:t>
+      </w:r>
+      <w:r>
+        <w:t xml:space="preserve"> </w:t>
+      </w:r>
+      <w:r>
+        <w:t xml:space="preserve">estaciones se escriben distinto en los dos archivos y se emparejaron a mano. Las 11 estaciones del</w:t>
+      </w:r>
+      <w:r>
+        <w:t xml:space="preserve"> </w:t>
+      </w:r>
+      <w:r>
+        <w:t xml:space="preserve">Estado de México (Líneas 2, A y B) recibieron la clave INEGI de su municipio, así que ninguna estación</w:t>
+      </w:r>
+      <w:r>
+        <w:t xml:space="preserve"> </w:t>
+      </w:r>
+      <w:r>
+        <w:t xml:space="preserve">quedó sin clave. Con esto,</w:t>
+      </w:r>
+      <w:r>
+        <w:t xml:space="preserve"> </w:t>
+      </w:r>
+      <w:r>
+        <w:rPr>
+          <w:rStyle w:val="VerbatimChar"/>
+        </w:rPr>
+        <w:t xml:space="preserve">metro_estacion_mes</w:t>
+      </w:r>
+      <w:r>
+        <w:t xml:space="preserve"> </w:t>
+      </w:r>
+      <w:r>
+        <w:t xml:space="preserve">incluye</w:t>
+      </w:r>
+      <w:r>
+        <w:t xml:space="preserve"> </w:t>
+      </w:r>
+      <w:r>
+        <w:rPr>
+          <w:rStyle w:val="VerbatimChar"/>
+        </w:rPr>
+        <w:t xml:space="preserve">cve_alcaldia</w:t>
+      </w:r>
+      <w:r>
+        <w:t xml:space="preserve"> </w:t>
+      </w:r>
+      <w:r>
+        <w:t xml:space="preserve">y</w:t>
+      </w:r>
+      <w:r>
+        <w:t xml:space="preserve"> </w:t>
+      </w:r>
+      <w:r>
+        <w:rPr>
+          <w:rStyle w:val="VerbatimChar"/>
+        </w:rPr>
+        <w:t xml:space="preserve">alcaldia</w:t>
+      </w:r>
+      <w:r>
+        <w:t xml:space="preserve">, y se generó</w:t>
+      </w:r>
+      <w:r>
+        <w:t xml:space="preserve"> </w:t>
+      </w:r>
+      <w:r>
+        <w:rPr>
+          <w:rStyle w:val="VerbatimChar"/>
+        </w:rPr>
+        <w:t xml:space="preserve">metro_alcaldia_mes</w:t>
+      </w:r>
+      <w:r>
+        <w:t xml:space="preserve"> </w:t>
+      </w:r>
+      <w:r>
+        <w:t xml:space="preserve">(2,155 filas): la afluencia mensual de las</w:t>
+      </w:r>
+      <w:r>
+        <w:t xml:space="preserve"> </w:t>
+      </w:r>
+      <w:r>
+        <w:t xml:space="preserve">11 alcaldías de la CDMX con Metro. Cuajimalpa, La Magdalena Contreras, Milpa Alta, Tlalpan y</w:t>
+      </w:r>
+      <w:r>
+        <w:t xml:space="preserve"> </w:t>
+      </w:r>
+      <w:r>
+        <w:t xml:space="preserve">Xochimilco no tienen estaciones. En 2019, Cuauhtémoc concentró 370 millones de viajes, casi el doble</w:t>
+      </w:r>
+      <w:r>
+        <w:t xml:space="preserve"> </w:t>
+      </w:r>
+      <w:r>
+        <w:t xml:space="preserve">que Venustiano Carranza (199 millones).</w:t>
+      </w:r>
+    </w:p>
+    <w:bookmarkEnd w:id="137"/>
+    <w:bookmarkStart w:id="138" w:name="cierres-de-líneas.-1"/>
     <w:p>
       <w:pPr>
         <w:pStyle w:val="Heading4"/>
@@ -18395,8 +18621,8 @@
         <w:t xml:space="preserve">la falta de recuperación de la demanda.</w:t>
       </w:r>
     </w:p>
-    <w:bookmarkEnd w:id="137"/>
-    <w:bookmarkStart w:id="150" w:name="primeros-resultados.-3"/>
+    <w:bookmarkEnd w:id="138"/>
+    <w:bookmarkStart w:id="151" w:name="primeros-resultados.-3"/>
     <w:p>
       <w:pPr>
         <w:pStyle w:val="Heading4"/>
@@ -18471,7 +18697,7 @@
         <w:t xml:space="preserve">buena parte del año, llegó a 51.</w:t>
       </w:r>
     </w:p>
-    <w:bookmarkStart w:id="141" w:name="fig:metro_mensual"/>
+    <w:bookmarkStart w:id="142" w:name="fig:metro_mensual"/>
     <w:p>
       <w:pPr>
         <w:pStyle w:val="CaptionedFigure"/>
@@ -18481,18 +18707,18 @@
           <wp:inline>
             <wp:extent cx="5334000" cy="2000250"/>
             <wp:effectExtent b="0" l="0" r="0" t="0"/>
-            <wp:docPr descr="" title="" id="139" name="Picture"/>
+            <wp:docPr descr="" title="" id="140" name="Picture"/>
             <a:graphic>
               <a:graphicData uri="http://schemas.openxmlformats.org/drawingml/2006/picture">
                 <pic:pic>
                   <pic:nvPicPr>
-                    <pic:cNvPr descr="figuras/metro_limpio_mensual.png" id="140" name="Picture"/>
+                    <pic:cNvPr descr="figuras/metro_limpio_mensual.png" id="141" name="Picture"/>
                     <pic:cNvPicPr>
                       <a:picLocks noChangeArrowheads="1" noChangeAspect="1"/>
                     </pic:cNvPicPr>
                   </pic:nvPicPr>
                   <pic:blipFill>
-                    <a:blip r:embed="rId138"/>
+                    <a:blip r:embed="rId139"/>
                     <a:stretch>
                       <a:fillRect/>
                     </a:stretch>
@@ -18527,8 +18753,8 @@
         <w:t xml:space="preserve">Afluencia diaria promedio mensual del Metro, completo y sin las Líneas 1 y 12. Las bandas marcan los periodos de choque, transición y post-pandemia.</w:t>
       </w:r>
     </w:p>
-    <w:bookmarkEnd w:id="141"/>
-    <w:bookmarkStart w:id="145" w:name="fig:metro_lineas"/>
+    <w:bookmarkEnd w:id="142"/>
+    <w:bookmarkStart w:id="146" w:name="fig:metro_lineas"/>
     <w:p>
       <w:pPr>
         <w:pStyle w:val="CaptionedFigure"/>
@@ -18538,18 +18764,18 @@
           <wp:inline>
             <wp:extent cx="5334000" cy="3259666"/>
             <wp:effectExtent b="0" l="0" r="0" t="0"/>
-            <wp:docPr descr="" title="" id="143" name="Picture"/>
+            <wp:docPr descr="" title="" id="144" name="Picture"/>
             <a:graphic>
               <a:graphicData uri="http://schemas.openxmlformats.org/drawingml/2006/picture">
                 <pic:pic>
                   <pic:nvPicPr>
-                    <pic:cNvPr descr="figuras/metro_lineas_indice.png" id="144" name="Picture"/>
+                    <pic:cNvPr descr="figuras/metro_lineas_indice.png" id="145" name="Picture"/>
                     <pic:cNvPicPr>
                       <a:picLocks noChangeArrowheads="1" noChangeAspect="1"/>
                     </pic:cNvPicPr>
                   </pic:nvPicPr>
                   <pic:blipFill>
-                    <a:blip r:embed="rId142"/>
+                    <a:blip r:embed="rId143"/>
                     <a:stretch>
                       <a:fillRect/>
                     </a:stretch>
@@ -18584,8 +18810,8 @@
         <w:t xml:space="preserve">Afluencia diaria promedio por línea y año, índice 2019 = 100.</w:t>
       </w:r>
     </w:p>
-    <w:bookmarkEnd w:id="145"/>
-    <w:bookmarkStart w:id="149" w:name="fig:metro_cierres"/>
+    <w:bookmarkEnd w:id="146"/>
+    <w:bookmarkStart w:id="150" w:name="fig:metro_cierres"/>
     <w:p>
       <w:pPr>
         <w:pStyle w:val="CaptionedFigure"/>
@@ -18595,18 +18821,18 @@
           <wp:inline>
             <wp:extent cx="5334000" cy="1778000"/>
             <wp:effectExtent b="0" l="0" r="0" t="0"/>
-            <wp:docPr descr="" title="" id="147" name="Picture"/>
+            <wp:docPr descr="" title="" id="148" name="Picture"/>
             <a:graphic>
               <a:graphicData uri="http://schemas.openxmlformats.org/drawingml/2006/picture">
                 <pic:pic>
                   <pic:nvPicPr>
-                    <pic:cNvPr descr="figuras/metro_cierres.png" id="148" name="Picture"/>
+                    <pic:cNvPr descr="figuras/metro_cierres.png" id="149" name="Picture"/>
                     <pic:cNvPicPr>
                       <a:picLocks noChangeArrowheads="1" noChangeAspect="1"/>
                     </pic:cNvPicPr>
                   </pic:nvPicPr>
                   <pic:blipFill>
-                    <a:blip r:embed="rId146"/>
+                    <a:blip r:embed="rId147"/>
                     <a:stretch>
                       <a:fillRect/>
                     </a:stretch>
@@ -18641,10 +18867,10 @@
         <w:t xml:space="preserve">Estaciones del Metro cerradas por día. El pico de enero de 2021 corresponde al incendio del Puesto Central de Control.</w:t>
       </w:r>
     </w:p>
-    <w:bookmarkEnd w:id="149"/>
     <w:bookmarkEnd w:id="150"/>
     <w:bookmarkEnd w:id="151"/>
-    <w:bookmarkStart w:id="159" w:name="casos-positivos-de-covid-19"/>
+    <w:bookmarkEnd w:id="152"/>
+    <w:bookmarkStart w:id="160" w:name="casos-positivos-de-covid-19"/>
     <w:p>
       <w:pPr>
         <w:pStyle w:val="Heading2"/>
@@ -18696,7 +18922,7 @@
         <w:t xml:space="preserve">).</w:t>
       </w:r>
     </w:p>
-    <w:bookmarkStart w:id="152" w:name="tab:limpieza_covid"/>
+    <w:bookmarkStart w:id="153" w:name="tab:limpieza_covid"/>
     <w:p>
       <w:pPr>
         <w:pStyle w:val="TableCaption"/>
@@ -18928,8 +19154,8 @@
         </w:tc>
       </w:tr>
     </w:tbl>
-    <w:bookmarkEnd w:id="152"/>
-    <w:bookmarkStart w:id="153" w:name="salidas.-2"/>
+    <w:bookmarkEnd w:id="153"/>
+    <w:bookmarkStart w:id="154" w:name="salidas.-2"/>
     <w:p>
       <w:pPr>
         <w:pStyle w:val="Heading4"/>
@@ -19000,17 +19226,29 @@
         <w:t xml:space="preserve"> </w:t>
       </w:r>
       <w:r>
-        <w:t xml:space="preserve">primera y la última semana y el primer y el último mes están incompletos y se marcan. Después de</w:t>
-      </w:r>
-      <w:r>
-        <w:t xml:space="preserve"> </w:t>
-      </w:r>
-      <w:r>
-        <w:t xml:space="preserve">abril de 2023 no hay dato: al integrar se debe dejar vacío, no en 0.</w:t>
-      </w:r>
-    </w:p>
-    <w:bookmarkEnd w:id="153"/>
-    <w:bookmarkStart w:id="158" w:name="primeros-resultados.-4"/>
+        <w:t xml:space="preserve">primera y la última semana y el primer y el último mes están incompletos y se marcan. Las tablas no</w:t>
+      </w:r>
+      <w:r>
+        <w:t xml:space="preserve"> </w:t>
+      </w:r>
+      <w:r>
+        <w:t xml:space="preserve">tienen vacíos: en los 17 días agregados de marzo de 2020 no hubo pruebas ni positivos, así que su tasa</w:t>
+      </w:r>
+      <w:r>
+        <w:t xml:space="preserve"> </w:t>
+      </w:r>
+      <w:r>
+        <w:t xml:space="preserve">de positividad es 0, y en los primeros 6 días el promedio móvil se calcula con los días disponibles.</w:t>
+      </w:r>
+      <w:r>
+        <w:t xml:space="preserve"> </w:t>
+      </w:r>
+      <w:r>
+        <w:t xml:space="preserve">Después de abril de 2023 no hay dato: al integrar se debe dejar vacío, no en 0.</w:t>
+      </w:r>
+    </w:p>
+    <w:bookmarkEnd w:id="154"/>
+    <w:bookmarkStart w:id="159" w:name="primeros-resultados.-4"/>
     <w:p>
       <w:pPr>
         <w:pStyle w:val="Heading4"/>
@@ -19068,7 +19306,7 @@
         <w:t xml:space="preserve">positividad junto con los positivos.</w:t>
       </w:r>
     </w:p>
-    <w:bookmarkStart w:id="157" w:name="fig:covid"/>
+    <w:bookmarkStart w:id="158" w:name="fig:covid"/>
     <w:p>
       <w:pPr>
         <w:pStyle w:val="CaptionedFigure"/>
@@ -19078,18 +19316,18 @@
           <wp:inline>
             <wp:extent cx="5334000" cy="2889250"/>
             <wp:effectExtent b="0" l="0" r="0" t="0"/>
-            <wp:docPr descr="" title="" id="155" name="Picture"/>
+            <wp:docPr descr="" title="" id="156" name="Picture"/>
             <a:graphic>
               <a:graphicData uri="http://schemas.openxmlformats.org/drawingml/2006/picture">
                 <pic:pic>
                   <pic:nvPicPr>
-                    <pic:cNvPr descr="figuras/covid_semanal.png" id="156" name="Picture"/>
+                    <pic:cNvPr descr="figuras/covid_semanal.png" id="157" name="Picture"/>
                     <pic:cNvPicPr>
                       <a:picLocks noChangeArrowheads="1" noChangeAspect="1"/>
                     </pic:cNvPicPr>
                   </pic:nvPicPr>
                   <pic:blipFill>
-                    <a:blip r:embed="rId154"/>
+                    <a:blip r:embed="rId155"/>
                     <a:stretch>
                       <a:fillRect/>
                     </a:stretch>
@@ -19124,10 +19362,10 @@
         <w:t xml:space="preserve">Casos positivos de COVID-19 por semana y tasa de positividad (residentes de la CDMX).</w:t>
       </w:r>
     </w:p>
-    <w:bookmarkEnd w:id="157"/>
     <w:bookmarkEnd w:id="158"/>
     <w:bookmarkEnd w:id="159"/>
-    <w:bookmarkStart w:id="160" w:name="semáforo-epidemiológico"/>
+    <w:bookmarkEnd w:id="160"/>
+    <w:bookmarkStart w:id="161" w:name="semáforo-epidemiológico"/>
     <w:p>
       <w:pPr>
         <w:pStyle w:val="Heading2"/>
@@ -19329,9 +19567,9 @@
         <w:t xml:space="preserve">rojo, 42 en naranja, 20 en amarillo y 83 en verde.</w:t>
       </w:r>
     </w:p>
-    <w:bookmarkEnd w:id="160"/>
     <w:bookmarkEnd w:id="161"/>
-    <w:bookmarkStart w:id="168" w:name="sec:pendientes"/>
+    <w:bookmarkEnd w:id="162"/>
+    <w:bookmarkStart w:id="169" w:name="sec:pendientes"/>
     <w:p>
       <w:pPr>
         <w:pStyle w:val="Heading1"/>
@@ -19340,7 +19578,7 @@
         <w:t xml:space="preserve">Plan de trabajo y actividades pendientes</w:t>
       </w:r>
     </w:p>
-    <w:bookmarkStart w:id="162" w:name="preparación"/>
+    <w:bookmarkStart w:id="163" w:name="preparación"/>
     <w:p>
       <w:pPr>
         <w:pStyle w:val="Heading2"/>
@@ -19490,8 +19728,8 @@
         <w:t xml:space="preserve">☐ Confirmar los cortes de los periodos de análisis.</w:t>
       </w:r>
     </w:p>
-    <w:bookmarkEnd w:id="162"/>
-    <w:bookmarkStart w:id="163" w:name="descarga-14-conjuntos-seleccionados"/>
+    <w:bookmarkEnd w:id="163"/>
+    <w:bookmarkStart w:id="164" w:name="descarga-14-conjuntos-seleccionados"/>
     <w:p>
       <w:pPr>
         <w:pStyle w:val="Heading2"/>
@@ -19599,8 +19837,8 @@
         <w:t xml:space="preserve">☑ Pandemia y referencia: casos COVID, semáforo federal, Censo 2020, Marco Geoestadístico.</w:t>
       </w:r>
     </w:p>
-    <w:bookmarkEnd w:id="163"/>
-    <w:bookmarkStart w:id="164" w:name="tareas-surgidas-en-la-descarga"/>
+    <w:bookmarkEnd w:id="164"/>
+    <w:bookmarkStart w:id="165" w:name="tareas-surgidas-en-la-descarga"/>
     <w:p>
       <w:pPr>
         <w:pStyle w:val="Heading2"/>
@@ -19653,8 +19891,8 @@
         <w:t xml:space="preserve">☑ Rellenar las semanas 2020-W53 y 2022-W01 del semáforo.</w:t>
       </w:r>
     </w:p>
-    <w:bookmarkEnd w:id="164"/>
-    <w:bookmarkStart w:id="165" w:name="exploración"/>
+    <w:bookmarkEnd w:id="165"/>
+    <w:bookmarkStart w:id="166" w:name="exploración"/>
     <w:p>
       <w:pPr>
         <w:pStyle w:val="Heading2"/>
@@ -19685,8 +19923,8 @@
         <w:t xml:space="preserve">Documentar los cambios metodológicos de cada fuente.</w:t>
       </w:r>
     </w:p>
-    <w:bookmarkEnd w:id="165"/>
-    <w:bookmarkStart w:id="166" w:name="limpieza-selección-final"/>
+    <w:bookmarkEnd w:id="166"/>
+    <w:bookmarkStart w:id="167" w:name="limpieza-selección-final"/>
     <w:p>
       <w:pPr>
         <w:pStyle w:val="Heading2"/>
@@ -19811,8 +20049,8 @@
         <w:t xml:space="preserve">☐ Población por alcaldía (Censo 2020) para calcular tasas.</w:t>
       </w:r>
     </w:p>
-    <w:bookmarkEnd w:id="166"/>
-    <w:bookmarkStart w:id="167" w:name="integración-y-entrega"/>
+    <w:bookmarkEnd w:id="167"/>
+    <w:bookmarkStart w:id="168" w:name="integración-y-entrega"/>
     <w:p>
       <w:pPr>
         <w:pStyle w:val="Heading2"/>
@@ -19892,9 +20130,9 @@
         <w:t xml:space="preserve">Hacer un análisis descriptivo con gráficas antes, durante y después de la pandemia.</w:t>
       </w:r>
     </w:p>
-    <w:bookmarkEnd w:id="167"/>
     <w:bookmarkEnd w:id="168"/>
-    <w:bookmarkStart w:id="203" w:name="app:enlaces"/>
+    <w:bookmarkEnd w:id="169"/>
+    <w:bookmarkStart w:id="204" w:name="app:enlaces"/>
     <w:p>
       <w:pPr>
         <w:pStyle w:val="Heading1"/>
@@ -19903,7 +20141,7 @@
         <w:t xml:space="preserve">Enlaces a las fuentes</w:t>
       </w:r>
     </w:p>
-    <w:bookmarkStart w:id="179" w:name="movilidad-1"/>
+    <w:bookmarkStart w:id="180" w:name="movilidad-1"/>
     <w:p>
       <w:pPr>
         <w:pStyle w:val="Heading2"/>
@@ -19925,7 +20163,7 @@
       <w:r>
         <w:t xml:space="preserve"> </w:t>
       </w:r>
-      <w:hyperlink r:id="rId169">
+      <w:hyperlink r:id="rId170">
         <w:r>
           <w:rPr>
             <w:rStyle w:val="Hyperlink"/>
@@ -19947,7 +20185,7 @@
       <w:r>
         <w:t xml:space="preserve"> </w:t>
       </w:r>
-      <w:hyperlink r:id="rId170">
+      <w:hyperlink r:id="rId171">
         <w:r>
           <w:rPr>
             <w:rStyle w:val="Hyperlink"/>
@@ -19969,7 +20207,7 @@
       <w:r>
         <w:t xml:space="preserve"> </w:t>
       </w:r>
-      <w:hyperlink r:id="rId171">
+      <w:hyperlink r:id="rId172">
         <w:r>
           <w:rPr>
             <w:rStyle w:val="Hyperlink"/>
@@ -19991,7 +20229,7 @@
       <w:r>
         <w:t xml:space="preserve"> </w:t>
       </w:r>
-      <w:hyperlink r:id="rId172">
+      <w:hyperlink r:id="rId173">
         <w:r>
           <w:rPr>
             <w:rStyle w:val="Hyperlink"/>
@@ -20013,7 +20251,7 @@
       <w:r>
         <w:t xml:space="preserve"> </w:t>
       </w:r>
-      <w:hyperlink r:id="rId173">
+      <w:hyperlink r:id="rId174">
         <w:r>
           <w:rPr>
             <w:rStyle w:val="Hyperlink"/>
@@ -20035,7 +20273,7 @@
       <w:r>
         <w:t xml:space="preserve"> </w:t>
       </w:r>
-      <w:hyperlink r:id="rId174">
+      <w:hyperlink r:id="rId175">
         <w:r>
           <w:rPr>
             <w:rStyle w:val="Hyperlink"/>
@@ -20057,7 +20295,7 @@
       <w:r>
         <w:t xml:space="preserve"> </w:t>
       </w:r>
-      <w:hyperlink r:id="rId175">
+      <w:hyperlink r:id="rId176">
         <w:r>
           <w:rPr>
             <w:rStyle w:val="Hyperlink"/>
@@ -20079,7 +20317,7 @@
       <w:r>
         <w:t xml:space="preserve"> </w:t>
       </w:r>
-      <w:hyperlink r:id="rId176">
+      <w:hyperlink r:id="rId177">
         <w:r>
           <w:rPr>
             <w:rStyle w:val="Hyperlink"/>
@@ -20123,7 +20361,7 @@
       <w:r>
         <w:t xml:space="preserve"> </w:t>
       </w:r>
-      <w:hyperlink r:id="rId177">
+      <w:hyperlink r:id="rId178">
         <w:r>
           <w:rPr>
             <w:rStyle w:val="Hyperlink"/>
@@ -20145,7 +20383,7 @@
       <w:r>
         <w:t xml:space="preserve"> </w:t>
       </w:r>
-      <w:hyperlink r:id="rId178">
+      <w:hyperlink r:id="rId179">
         <w:r>
           <w:rPr>
             <w:rStyle w:val="Hyperlink"/>
@@ -20154,8 +20392,8 @@
         </w:r>
       </w:hyperlink>
     </w:p>
-    <w:bookmarkEnd w:id="179"/>
-    <w:bookmarkStart w:id="186" w:name="seguridad-1"/>
+    <w:bookmarkEnd w:id="180"/>
+    <w:bookmarkStart w:id="187" w:name="seguridad-1"/>
     <w:p>
       <w:pPr>
         <w:pStyle w:val="Heading2"/>
@@ -20177,7 +20415,7 @@
       <w:r>
         <w:t xml:space="preserve"> </w:t>
       </w:r>
-      <w:hyperlink r:id="rId180">
+      <w:hyperlink r:id="rId181">
         <w:r>
           <w:rPr>
             <w:rStyle w:val="Hyperlink"/>
@@ -20199,7 +20437,7 @@
       <w:r>
         <w:t xml:space="preserve"> </w:t>
       </w:r>
-      <w:hyperlink r:id="rId181">
+      <w:hyperlink r:id="rId182">
         <w:r>
           <w:rPr>
             <w:rStyle w:val="Hyperlink"/>
@@ -20221,7 +20459,7 @@
       <w:r>
         <w:t xml:space="preserve"> </w:t>
       </w:r>
-      <w:hyperlink r:id="rId182">
+      <w:hyperlink r:id="rId183">
         <w:r>
           <w:rPr>
             <w:rStyle w:val="Hyperlink"/>
@@ -20243,7 +20481,7 @@
       <w:r>
         <w:t xml:space="preserve"> </w:t>
       </w:r>
-      <w:hyperlink r:id="rId183">
+      <w:hyperlink r:id="rId184">
         <w:r>
           <w:rPr>
             <w:rStyle w:val="Hyperlink"/>
@@ -20265,7 +20503,7 @@
       <w:r>
         <w:t xml:space="preserve"> </w:t>
       </w:r>
-      <w:hyperlink r:id="rId184">
+      <w:hyperlink r:id="rId185">
         <w:r>
           <w:rPr>
             <w:rStyle w:val="Hyperlink"/>
@@ -20287,7 +20525,7 @@
       <w:r>
         <w:t xml:space="preserve"> </w:t>
       </w:r>
-      <w:hyperlink r:id="rId185">
+      <w:hyperlink r:id="rId186">
         <w:r>
           <w:rPr>
             <w:rStyle w:val="Hyperlink"/>
@@ -20296,8 +20534,8 @@
         </w:r>
       </w:hyperlink>
     </w:p>
-    <w:bookmarkEnd w:id="186"/>
-    <w:bookmarkStart w:id="195" w:name="actividad-económica-1"/>
+    <w:bookmarkEnd w:id="187"/>
+    <w:bookmarkStart w:id="196" w:name="actividad-económica-1"/>
     <w:p>
       <w:pPr>
         <w:pStyle w:val="Heading2"/>
@@ -20319,7 +20557,7 @@
       <w:r>
         <w:t xml:space="preserve"> </w:t>
       </w:r>
-      <w:hyperlink r:id="rId187">
+      <w:hyperlink r:id="rId188">
         <w:r>
           <w:rPr>
             <w:rStyle w:val="Hyperlink"/>
@@ -20341,7 +20579,7 @@
       <w:r>
         <w:t xml:space="preserve"> </w:t>
       </w:r>
-      <w:hyperlink r:id="rId188">
+      <w:hyperlink r:id="rId189">
         <w:r>
           <w:rPr>
             <w:rStyle w:val="Hyperlink"/>
@@ -20363,7 +20601,7 @@
       <w:r>
         <w:t xml:space="preserve"> </w:t>
       </w:r>
-      <w:hyperlink r:id="rId189">
+      <w:hyperlink r:id="rId190">
         <w:r>
           <w:rPr>
             <w:rStyle w:val="Hyperlink"/>
@@ -20385,7 +20623,7 @@
       <w:r>
         <w:t xml:space="preserve"> </w:t>
       </w:r>
-      <w:hyperlink r:id="rId190">
+      <w:hyperlink r:id="rId191">
         <w:r>
           <w:rPr>
             <w:rStyle w:val="Hyperlink"/>
@@ -20407,7 +20645,7 @@
       <w:r>
         <w:t xml:space="preserve"> </w:t>
       </w:r>
-      <w:hyperlink r:id="rId191">
+      <w:hyperlink r:id="rId192">
         <w:r>
           <w:rPr>
             <w:rStyle w:val="Hyperlink"/>
@@ -20429,7 +20667,7 @@
       <w:r>
         <w:t xml:space="preserve"> </w:t>
       </w:r>
-      <w:hyperlink r:id="rId192">
+      <w:hyperlink r:id="rId193">
         <w:r>
           <w:rPr>
             <w:rStyle w:val="Hyperlink"/>
@@ -20451,7 +20689,7 @@
       <w:r>
         <w:t xml:space="preserve"> </w:t>
       </w:r>
-      <w:hyperlink r:id="rId193">
+      <w:hyperlink r:id="rId194">
         <w:r>
           <w:rPr>
             <w:rStyle w:val="Hyperlink"/>
@@ -20473,7 +20711,7 @@
       <w:r>
         <w:t xml:space="preserve"> </w:t>
       </w:r>
-      <w:hyperlink r:id="rId194">
+      <w:hyperlink r:id="rId195">
         <w:r>
           <w:rPr>
             <w:rStyle w:val="Hyperlink"/>
@@ -20482,8 +20720,8 @@
         </w:r>
       </w:hyperlink>
     </w:p>
-    <w:bookmarkEnd w:id="195"/>
-    <w:bookmarkStart w:id="202" w:name="pandemia"/>
+    <w:bookmarkEnd w:id="196"/>
+    <w:bookmarkStart w:id="203" w:name="pandemia"/>
     <w:p>
       <w:pPr>
         <w:pStyle w:val="Heading2"/>
@@ -20505,7 +20743,7 @@
       <w:r>
         <w:t xml:space="preserve"> </w:t>
       </w:r>
-      <w:hyperlink r:id="rId196">
+      <w:hyperlink r:id="rId197">
         <w:r>
           <w:rPr>
             <w:rStyle w:val="Hyperlink"/>
@@ -20527,7 +20765,7 @@
       <w:r>
         <w:t xml:space="preserve"> </w:t>
       </w:r>
-      <w:hyperlink r:id="rId197">
+      <w:hyperlink r:id="rId198">
         <w:r>
           <w:rPr>
             <w:rStyle w:val="Hyperlink"/>
@@ -20549,7 +20787,7 @@
       <w:r>
         <w:t xml:space="preserve"> </w:t>
       </w:r>
-      <w:hyperlink r:id="rId198">
+      <w:hyperlink r:id="rId199">
         <w:r>
           <w:rPr>
             <w:rStyle w:val="Hyperlink"/>
@@ -20571,7 +20809,7 @@
       <w:r>
         <w:t xml:space="preserve"> </w:t>
       </w:r>
-      <w:hyperlink r:id="rId199">
+      <w:hyperlink r:id="rId200">
         <w:r>
           <w:rPr>
             <w:rStyle w:val="Hyperlink"/>
@@ -20593,7 +20831,7 @@
       <w:r>
         <w:t xml:space="preserve"> </w:t>
       </w:r>
-      <w:hyperlink r:id="rId200">
+      <w:hyperlink r:id="rId201">
         <w:r>
           <w:rPr>
             <w:rStyle w:val="Hyperlink"/>
@@ -20615,7 +20853,7 @@
       <w:r>
         <w:t xml:space="preserve"> </w:t>
       </w:r>
-      <w:hyperlink r:id="rId201">
+      <w:hyperlink r:id="rId202">
         <w:r>
           <w:rPr>
             <w:rStyle w:val="Hyperlink"/>
@@ -20624,8 +20862,8 @@
         </w:r>
       </w:hyperlink>
     </w:p>
-    <w:bookmarkEnd w:id="202"/>
     <w:bookmarkEnd w:id="203"/>
+    <w:bookmarkEnd w:id="204"/>
     <w:sectPr>
       <w:footnotePr>
         <w:numRestart w:val="eachSect"/>

</xml_diff>